<commit_message>
Assignment 3: auto-detect data folder, support Jupyter/Windows
Co-Authored-By: Claude Sonnet 5.5 <noreply@anthropic.com>
Claude-Session: https://claude.ai/code/session_019U7xD7dRNmFbb5qmqNLe8L
</commit_message>
<xml_diff>
--- a/assignment3/Assignment3_Report.docx
+++ b/assignment3/Assignment3_Report.docx
@@ -15,7 +15,7 @@
         <w:rPr>
           <w:b w:val="0"/>
         </w:rPr>
-        <w:t>Dataset: MIMIC-IV Clinical Database Demo v2.2 (100 patients). Code: assignment3_mimic_eda.py (all numbers/figures below are its output; log in outputs/run_log.txt).</w:t>
+        <w:t>Dataset: MIMIC-IV Clinical Database Demo v2.2 (100 patients). Code: assignment3_mimic_eda.py (all numbers/figures below are its output; log in assignment3_outputs/run_log.txt).</w:t>
       </w:r>
     </w:p>
     <w:p>
@@ -2377,7 +2377,7 @@
         <w:rPr>
           <w:b w:val="0"/>
         </w:rPr>
-        <w:t>Run: python assignment3_mimic_eda.py &lt;path to mimic-iv-clinical-database-demo-2.2&gt; outputs, then python build_report.py. Requires pandas, numpy, scipy, matplotlib, seaborn, python-docx. All figures in this report are generated by that script.</w:t>
+        <w:t>Run: python assignment3_mimic_eda.py &lt;path to mimic-iv-clinical-database-demo-2.2&gt; (writes assignment3_outputs), then python build_report.py. Requires pandas, numpy, scipy, matplotlib, seaborn, python-docx. All figures in this report are generated by that script.</w:t>
       </w:r>
     </w:p>
     <w:sectPr>

</xml_diff>

<commit_message>
Assignment 3: use Slide 55 outlier table for A3
Co-Authored-By: Claude Sonnet 5.5 <noreply@anthropic.com>
Claude-Session: https://claude.ai/code/session_019U7xD7dRNmFbb5qmqNLe8L
</commit_message>
<xml_diff>
--- a/assignment3/Assignment3_Report.docx
+++ b/assignment3/Assignment3_Report.docx
@@ -47,7 +47,7 @@
         <w:rPr>
           <w:b w:val="0"/>
         </w:rPr>
-        <w:t>1. The physiologic range table from “Slide 55” was not among the files I was given, so I could not use it. I used my own conventional impossible-value limits (HR 20–300 bpm, SpO2 50–100 %, Temp 25–45 °C) and also report a stricter sensitivity range. The bounds are one dictionary (RANGES) in the script; if your slide differs, edit it and re-run and the counts in Part A3 update.</w:t>
+        <w:t>1. The physiologic range table is the one on Slide 55 (provided by you as an image): HR 20–250 bpm (flag &lt;20 or &gt;250), SpO2 60–100 % (flag &gt;100 or =0), temperature 30–43 °C (flag &lt;30 or &gt;43). For SpO2 the slide’s valid range (60–100) and its flag condition (&gt;100 or =0) are not the same rule, so I report both counts and say which is which. The rules are in one dictionary (SLIDE) in the script.</w:t>
       </w:r>
     </w:p>
     <w:p>
@@ -237,21 +237,22 @@
         <w:tblLook w:firstColumn="1" w:firstRow="1" w:lastColumn="0" w:lastRow="0" w:noHBand="0" w:noVBand="1" w:val="04A0"/>
       </w:tblPr>
       <w:tblGrid>
-        <w:gridCol w:w="864"/>
-        <w:gridCol w:w="864"/>
-        <w:gridCol w:w="864"/>
-        <w:gridCol w:w="864"/>
-        <w:gridCol w:w="864"/>
-        <w:gridCol w:w="864"/>
-        <w:gridCol w:w="864"/>
-        <w:gridCol w:w="864"/>
-        <w:gridCol w:w="864"/>
-        <w:gridCol w:w="864"/>
+        <w:gridCol w:w="785"/>
+        <w:gridCol w:w="785"/>
+        <w:gridCol w:w="785"/>
+        <w:gridCol w:w="785"/>
+        <w:gridCol w:w="785"/>
+        <w:gridCol w:w="785"/>
+        <w:gridCol w:w="785"/>
+        <w:gridCol w:w="785"/>
+        <w:gridCol w:w="785"/>
+        <w:gridCol w:w="785"/>
+        <w:gridCol w:w="785"/>
       </w:tblGrid>
       <w:tr>
         <w:tc>
           <w:tcPr>
-            <w:tcW w:type="dxa" w:w="864"/>
+            <w:tcW w:type="dxa" w:w="785"/>
           </w:tcPr>
           <w:p>
             <w:r>
@@ -261,7 +262,7 @@
         </w:tc>
         <w:tc>
           <w:tcPr>
-            <w:tcW w:type="dxa" w:w="864"/>
+            <w:tcW w:type="dxa" w:w="785"/>
           </w:tcPr>
           <w:p>
             <w:r>
@@ -271,81 +272,91 @@
         </w:tc>
         <w:tc>
           <w:tcPr>
-            <w:tcW w:type="dxa" w:w="864"/>
+            <w:tcW w:type="dxa" w:w="785"/>
           </w:tcPr>
           <w:p>
             <w:r>
-              <w:t>valid_range</w:t>
+              <w:t>slide valid range</w:t>
             </w:r>
           </w:p>
         </w:tc>
         <w:tc>
           <w:tcPr>
-            <w:tcW w:type="dxa" w:w="864"/>
+            <w:tcW w:type="dxa" w:w="785"/>
           </w:tcPr>
           <w:p>
             <w:r>
-              <w:t>n_obs</w:t>
+              <w:t>slide flag condition</w:t>
             </w:r>
           </w:p>
         </w:tc>
         <w:tc>
           <w:tcPr>
-            <w:tcW w:type="dxa" w:w="864"/>
+            <w:tcW w:type="dxa" w:w="785"/>
           </w:tcPr>
           <w:p>
             <w:r>
-              <w:t>n_flagged</w:t>
+              <w:t>n values</w:t>
             </w:r>
           </w:p>
         </w:tc>
         <w:tc>
           <w:tcPr>
-            <w:tcW w:type="dxa" w:w="864"/>
+            <w:tcW w:type="dxa" w:w="785"/>
           </w:tcPr>
           <w:p>
             <w:r>
-              <w:t>pct_flagged</w:t>
+              <w:t>n flagged (flag condition)</w:t>
             </w:r>
           </w:p>
         </w:tc>
         <w:tc>
           <w:tcPr>
-            <w:tcW w:type="dxa" w:w="864"/>
+            <w:tcW w:type="dxa" w:w="785"/>
           </w:tcPr>
           <w:p>
             <w:r>
-              <w:t>n_below</w:t>
+              <w:t>% flagged</w:t>
             </w:r>
           </w:p>
         </w:tc>
         <w:tc>
           <w:tcPr>
-            <w:tcW w:type="dxa" w:w="864"/>
+            <w:tcW w:type="dxa" w:w="785"/>
           </w:tcPr>
           <w:p>
             <w:r>
-              <w:t>n_above</w:t>
+              <w:t>n outside valid range</w:t>
             </w:r>
           </w:p>
         </w:tc>
         <w:tc>
           <w:tcPr>
-            <w:tcW w:type="dxa" w:w="864"/>
+            <w:tcW w:type="dxa" w:w="785"/>
           </w:tcPr>
           <w:p>
             <w:r>
-              <w:t>observed_min</w:t>
+              <w:t>% outside valid range</w:t>
             </w:r>
           </w:p>
         </w:tc>
         <w:tc>
           <w:tcPr>
-            <w:tcW w:type="dxa" w:w="864"/>
+            <w:tcW w:type="dxa" w:w="785"/>
           </w:tcPr>
           <w:p>
             <w:r>
-              <w:t>observed_max</w:t>
+              <w:t>min</w:t>
+            </w:r>
+          </w:p>
+        </w:tc>
+        <w:tc>
+          <w:tcPr>
+            <w:tcW w:type="dxa" w:w="785"/>
+          </w:tcPr>
+          <w:p>
+            <w:r>
+              <w:t>max</w:t>
             </w:r>
           </w:p>
         </w:tc>
@@ -353,7 +364,7 @@
       <w:tr>
         <w:tc>
           <w:tcPr>
-            <w:tcW w:type="dxa" w:w="864"/>
+            <w:tcW w:type="dxa" w:w="785"/>
           </w:tcPr>
           <w:p>
             <w:r>
@@ -363,7 +374,7 @@
         </w:tc>
         <w:tc>
           <w:tcPr>
-            <w:tcW w:type="dxa" w:w="864"/>
+            <w:tcW w:type="dxa" w:w="785"/>
           </w:tcPr>
           <w:p>
             <w:r>
@@ -373,17 +384,27 @@
         </w:tc>
         <w:tc>
           <w:tcPr>
-            <w:tcW w:type="dxa" w:w="864"/>
+            <w:tcW w:type="dxa" w:w="785"/>
           </w:tcPr>
           <w:p>
             <w:r>
-              <w:t>20-300</w:t>
+              <w:t>20-250</w:t>
             </w:r>
           </w:p>
         </w:tc>
         <w:tc>
           <w:tcPr>
-            <w:tcW w:type="dxa" w:w="864"/>
+            <w:tcW w:type="dxa" w:w="785"/>
+          </w:tcPr>
+          <w:p>
+            <w:r>
+              <w:t>&lt;20 or &gt;250</w:t>
+            </w:r>
+          </w:p>
+        </w:tc>
+        <w:tc>
+          <w:tcPr>
+            <w:tcW w:type="dxa" w:w="785"/>
           </w:tcPr>
           <w:p>
             <w:r>
@@ -393,7 +414,7 @@
         </w:tc>
         <w:tc>
           <w:tcPr>
-            <w:tcW w:type="dxa" w:w="864"/>
+            <w:tcW w:type="dxa" w:w="785"/>
           </w:tcPr>
           <w:p>
             <w:r>
@@ -403,7 +424,7 @@
         </w:tc>
         <w:tc>
           <w:tcPr>
-            <w:tcW w:type="dxa" w:w="864"/>
+            <w:tcW w:type="dxa" w:w="785"/>
           </w:tcPr>
           <w:p>
             <w:r>
@@ -413,7 +434,7 @@
         </w:tc>
         <w:tc>
           <w:tcPr>
-            <w:tcW w:type="dxa" w:w="864"/>
+            <w:tcW w:type="dxa" w:w="785"/>
           </w:tcPr>
           <w:p>
             <w:r>
@@ -423,17 +444,17 @@
         </w:tc>
         <w:tc>
           <w:tcPr>
-            <w:tcW w:type="dxa" w:w="864"/>
+            <w:tcW w:type="dxa" w:w="785"/>
           </w:tcPr>
           <w:p>
             <w:r>
-              <w:t>0</w:t>
+              <w:t>0.0216</w:t>
             </w:r>
           </w:p>
         </w:tc>
         <w:tc>
           <w:tcPr>
-            <w:tcW w:type="dxa" w:w="864"/>
+            <w:tcW w:type="dxa" w:w="785"/>
           </w:tcPr>
           <w:p>
             <w:r>
@@ -443,7 +464,7 @@
         </w:tc>
         <w:tc>
           <w:tcPr>
-            <w:tcW w:type="dxa" w:w="864"/>
+            <w:tcW w:type="dxa" w:w="785"/>
           </w:tcPr>
           <w:p>
             <w:r>
@@ -455,7 +476,7 @@
       <w:tr>
         <w:tc>
           <w:tcPr>
-            <w:tcW w:type="dxa" w:w="864"/>
+            <w:tcW w:type="dxa" w:w="785"/>
           </w:tcPr>
           <w:p>
             <w:r>
@@ -465,7 +486,7 @@
         </w:tc>
         <w:tc>
           <w:tcPr>
-            <w:tcW w:type="dxa" w:w="864"/>
+            <w:tcW w:type="dxa" w:w="785"/>
           </w:tcPr>
           <w:p>
             <w:r>
@@ -475,17 +496,27 @@
         </w:tc>
         <w:tc>
           <w:tcPr>
-            <w:tcW w:type="dxa" w:w="864"/>
+            <w:tcW w:type="dxa" w:w="785"/>
           </w:tcPr>
           <w:p>
             <w:r>
-              <w:t>50-100</w:t>
+              <w:t>60-100</w:t>
             </w:r>
           </w:p>
         </w:tc>
         <w:tc>
           <w:tcPr>
-            <w:tcW w:type="dxa" w:w="864"/>
+            <w:tcW w:type="dxa" w:w="785"/>
+          </w:tcPr>
+          <w:p>
+            <w:r>
+              <w:t>&gt;100 or =0</w:t>
+            </w:r>
+          </w:p>
+        </w:tc>
+        <w:tc>
+          <w:tcPr>
+            <w:tcW w:type="dxa" w:w="785"/>
           </w:tcPr>
           <w:p>
             <w:r>
@@ -495,37 +526,7 @@
         </w:tc>
         <w:tc>
           <w:tcPr>
-            <w:tcW w:type="dxa" w:w="864"/>
-          </w:tcPr>
-          <w:p>
-            <w:r>
-              <w:t>3</w:t>
-            </w:r>
-          </w:p>
-        </w:tc>
-        <w:tc>
-          <w:tcPr>
-            <w:tcW w:type="dxa" w:w="864"/>
-          </w:tcPr>
-          <w:p>
-            <w:r>
-              <w:t>0.0222</w:t>
-            </w:r>
-          </w:p>
-        </w:tc>
-        <w:tc>
-          <w:tcPr>
-            <w:tcW w:type="dxa" w:w="864"/>
-          </w:tcPr>
-          <w:p>
-            <w:r>
-              <w:t>3</w:t>
-            </w:r>
-          </w:p>
-        </w:tc>
-        <w:tc>
-          <w:tcPr>
-            <w:tcW w:type="dxa" w:w="864"/>
+            <w:tcW w:type="dxa" w:w="785"/>
           </w:tcPr>
           <w:p>
             <w:r>
@@ -535,7 +536,37 @@
         </w:tc>
         <w:tc>
           <w:tcPr>
-            <w:tcW w:type="dxa" w:w="864"/>
+            <w:tcW w:type="dxa" w:w="785"/>
+          </w:tcPr>
+          <w:p>
+            <w:r>
+              <w:t>0.0</w:t>
+            </w:r>
+          </w:p>
+        </w:tc>
+        <w:tc>
+          <w:tcPr>
+            <w:tcW w:type="dxa" w:w="785"/>
+          </w:tcPr>
+          <w:p>
+            <w:r>
+              <w:t>5</w:t>
+            </w:r>
+          </w:p>
+        </w:tc>
+        <w:tc>
+          <w:tcPr>
+            <w:tcW w:type="dxa" w:w="785"/>
+          </w:tcPr>
+          <w:p>
+            <w:r>
+              <w:t>0.0369</w:t>
+            </w:r>
+          </w:p>
+        </w:tc>
+        <w:tc>
+          <w:tcPr>
+            <w:tcW w:type="dxa" w:w="785"/>
           </w:tcPr>
           <w:p>
             <w:r>
@@ -545,7 +576,7 @@
         </w:tc>
         <w:tc>
           <w:tcPr>
-            <w:tcW w:type="dxa" w:w="864"/>
+            <w:tcW w:type="dxa" w:w="785"/>
           </w:tcPr>
           <w:p>
             <w:r>
@@ -557,7 +588,7 @@
       <w:tr>
         <w:tc>
           <w:tcPr>
-            <w:tcW w:type="dxa" w:w="864"/>
+            <w:tcW w:type="dxa" w:w="785"/>
           </w:tcPr>
           <w:p>
             <w:r>
@@ -567,7 +598,7 @@
         </w:tc>
         <w:tc>
           <w:tcPr>
-            <w:tcW w:type="dxa" w:w="864"/>
+            <w:tcW w:type="dxa" w:w="785"/>
           </w:tcPr>
           <w:p>
             <w:r>
@@ -577,17 +608,27 @@
         </w:tc>
         <w:tc>
           <w:tcPr>
-            <w:tcW w:type="dxa" w:w="864"/>
+            <w:tcW w:type="dxa" w:w="785"/>
           </w:tcPr>
           <w:p>
             <w:r>
-              <w:t>25-45</w:t>
+              <w:t>30-43</w:t>
             </w:r>
           </w:p>
         </w:tc>
         <w:tc>
           <w:tcPr>
-            <w:tcW w:type="dxa" w:w="864"/>
+            <w:tcW w:type="dxa" w:w="785"/>
+          </w:tcPr>
+          <w:p>
+            <w:r>
+              <w:t>&lt;30 or &gt;43</w:t>
+            </w:r>
+          </w:p>
+        </w:tc>
+        <w:tc>
+          <w:tcPr>
+            <w:tcW w:type="dxa" w:w="785"/>
           </w:tcPr>
           <w:p>
             <w:r>
@@ -597,7 +638,7 @@
         </w:tc>
         <w:tc>
           <w:tcPr>
-            <w:tcW w:type="dxa" w:w="864"/>
+            <w:tcW w:type="dxa" w:w="785"/>
           </w:tcPr>
           <w:p>
             <w:r>
@@ -607,7 +648,7 @@
         </w:tc>
         <w:tc>
           <w:tcPr>
-            <w:tcW w:type="dxa" w:w="864"/>
+            <w:tcW w:type="dxa" w:w="785"/>
           </w:tcPr>
           <w:p>
             <w:r>
@@ -617,17 +658,7 @@
         </w:tc>
         <w:tc>
           <w:tcPr>
-            <w:tcW w:type="dxa" w:w="864"/>
-          </w:tcPr>
-          <w:p>
-            <w:r>
-              <w:t>0</w:t>
-            </w:r>
-          </w:p>
-        </w:tc>
-        <w:tc>
-          <w:tcPr>
-            <w:tcW w:type="dxa" w:w="864"/>
+            <w:tcW w:type="dxa" w:w="785"/>
           </w:tcPr>
           <w:p>
             <w:r>
@@ -637,7 +668,17 @@
         </w:tc>
         <w:tc>
           <w:tcPr>
-            <w:tcW w:type="dxa" w:w="864"/>
+            <w:tcW w:type="dxa" w:w="785"/>
+          </w:tcPr>
+          <w:p>
+            <w:r>
+              <w:t>0.0796</w:t>
+            </w:r>
+          </w:p>
+        </w:tc>
+        <w:tc>
+          <w:tcPr>
+            <w:tcW w:type="dxa" w:w="785"/>
           </w:tcPr>
           <w:p>
             <w:r>
@@ -647,7 +688,7 @@
         </w:tc>
         <w:tc>
           <w:tcPr>
-            <w:tcW w:type="dxa" w:w="864"/>
+            <w:tcW w:type="dxa" w:w="785"/>
           </w:tcPr>
           <w:p>
             <w:r>
@@ -699,7 +740,7 @@
         <w:rPr>
           <w:b w:val="0"/>
         </w:rPr>
-        <w:t>Range table used (assumption, see notes): HR 20–300, SpO2 50–100, Temp 25–45 °C (Fahrenheit readings converted to °C first). Flagged values: HR: three readings of exactly 0 (artefact/disconnected sensor or asystole not plausible alongside the rest of the record); SpO2: three readings below 50 % (29, 43 and 47 %); temperature: three readings of 97.2, 98.9 and 99.0 charted in the Celsius item, which are clearly Fahrenheit values entered in the wrong field (a unit-entry error). Rates are tiny: 0.022% (HR), 0.022% (SpO2), 0.080% (Temp). With a stricter range (HR 30–220, SpO2 70–100, Temp 32–42 °C) the counts become 5, 9 and 5 (0.036%, 0.066%, 0.133%), so the result is sensitive to where the bounds are drawn, but remains well under 1 %. Flagged values are excluded in A5.</w:t>
+        <w:t>Rule table applied (Slide 55): heart rate 20–250 bpm (flag &lt;20 or &gt;250); SpO2 60–100 % (flag &gt;100 or =0); temperature 30–43 °C (flag &lt;30 or &gt;43), with Fahrenheit readings converted to °C first. Heart rate: 3 of 13,913 values flagged (0.022%), all exactly 0 (sensor/monitor artefact). Temperature: 3 of 3,770 flagged (0.080%): [97.2, 98.9, 99.0] charted in the Celsius item, which are Fahrenheit values entered as °C, exactly the unit mismatch the slide lists as the likely cause. SpO2: using the slide’s flag condition (&gt;100 or =0) 0 of 13,540 values are flagged (0.000%); the maximum is exactly 100 and there are no zeros. If instead the stated valid range 60–100 is used, 5 values are out of range (0.037%): [29.0, 43.0, 47.0, 50.0, 52.0]. These are low but not physically impossible (severe hypoxemia, or a poor probe signal), so they are suspicious rather than certainly wrong, and I would review them rather than silently delete them. In all three variables the rate of impossible values is far below 1 %, i.e. these monitors are clean, and most of the problems are unit and sensor artefacts. In A5 I removed values outside the slide’s valid ranges (HR 20–250, SpO2 60–100, Temp 30–43).</w:t>
       </w:r>
     </w:p>
     <w:p>

</xml_diff>

<commit_message>
Assignment 3: address review feedback (wording, A1, B3, cleaner printouts)
Co-Authored-By: Claude Sonnet 5.5 <noreply@anthropic.com>
Claude-Session: https://claude.ai/code/session_019U7xD7dRNmFbb5qmqNLe8L
</commit_message>
<xml_diff>
--- a/assignment3/Assignment3_Report.docx
+++ b/assignment3/Assignment3_Report.docx
@@ -15,7 +15,7 @@
         <w:rPr>
           <w:b w:val="0"/>
         </w:rPr>
-        <w:t>Dataset: MIMIC-IV Clinical Database Demo v2.2 (100 patients). Code: assignment3_mimic_eda.py (all numbers/figures below are its output; log in assignment3_outputs/run_log.txt).</w:t>
+        <w:t>Dataset: MIMIC-IV Clinical Database Demo v2.2 (100 patients). All numbers and figures below are produced by the analysis code.</w:t>
       </w:r>
     </w:p>
     <w:p>
@@ -47,7 +47,7 @@
         <w:rPr>
           <w:b w:val="0"/>
         </w:rPr>
-        <w:t>1. The physiologic range table is the one on Slide 55 (provided by you as an image): HR 20–250 bpm (flag &lt;20 or &gt;250), SpO2 60–100 % (flag &gt;100 or =0), temperature 30–43 °C (flag &lt;30 or &gt;43). For SpO2 the slide’s valid range (60–100) and its flag condition (&gt;100 or =0) are not the same rule, so I report both counts and say which is which. The rules are in one dictionary (SLIDE) in the script.</w:t>
+        <w:t>1. The physiologic range table is the one from Slide 55 (Outlier Detection: Physiologically Impossible Values): HR 20–250 bpm (flag &lt;20 or &gt;250), SpO2 60–100 % (flag &gt;100 or =0), temperature 30–43 °C (flag &lt;30 or &gt;43). For SpO2 the slide’s valid range (60–100) and its flag condition (&gt;100 or =0) are not the same rule, so I report both counts and say which is which. The rules are in one dictionary (SLIDE) in the A3 code.</w:t>
       </w:r>
     </w:p>
     <w:p>
@@ -55,7 +55,7 @@
         <w:rPr>
           <w:b w:val="0"/>
         </w:rPr>
-        <w:t>2. The d_labitems.csv.gz in this demo has only the columns itemid, label, fluid, category. There is no loinc_code column, so the LOINC coverage answer in Part B is 0 % (see B3), not a number I could estimate from data.</w:t>
+        <w:t>2. The d_labitems.csv.gz in this demo has only the columns itemid, label, fluid, category. There is no loinc_code column, so the LOINC coverage answer in Part B is 0 % (see B3).</w:t>
       </w:r>
     </w:p>
     <w:p>
@@ -115,7 +115,7 @@
         <w:rPr>
           <w:b w:val="0"/>
         </w:rPr>
-        <w:t>Heart rate (n=13,913 charted values): mean 91.1, median 90, SD 18.7, skew 0.23, range 0–200. It is unimodal and close to symmetric with a slightly longer right tail; the only odd feature is a handful of zeros (artefact, see A3). Creatinine (n=923 values): median 1.2 mg/dL (IQR 0.7–2.3), max 15.2, skew 2.43, excess kurtosis 11.6. It is strongly right-skewed with a heavy tail (patients in renal failure); after a log transform the skew falls to 0.09, so it is roughly log-normal and a log transform is appropriate before using it in a linear or distance-based model. Note that the values are repeated measurements within stays, so they are not independent samples.</w:t>
+        <w:t>Heart rate (n=13,913 charted values): mean 91.1, median 90, SD 18.7, skew 0.23, range 0–200. It is unimodal and close to symmetric with a slightly longer right tail; the only odd feature is a handful of zeros (artefact, see A3). Creatinine (n=923 values): median 1.2 mg/dL (IQR 0.7–2.3), max 15.2, skew 2.43, excess kurtosis 11.6. It is strongly right-skewed with a heavy tail (patients in renal failure); after a log transform the skew falls to 0.09, so it is roughly log-normal and a log transform is appropriate before using it in a linear or distance-based model. On the log scale the creatinine histogram has a main mode near 0.6 mg/dL and a weaker second hump around 1.5–2.7 mg/dL (a shoulder rather than a clean second peak). That pattern is consistent with a mixture of patients with normal kidney function and patients with impaired function, but I did not test this. The gaps on the left of the log histogram come from creatinine being reported to 0.1 mg/dL. The comb-like bars in the heart-rate histogram come from integer values meeting the bin width, not from round-number rounding: 21.4% of heart rates are multiples of 5, against 20% expected with no digit preference. Note that the values are repeated measurements within stays, so they are not independent samples.</w:t>
       </w:r>
     </w:p>
     <w:p>
@@ -2338,7 +2338,7 @@
         <w:rPr>
           <w:b w:val="0"/>
         </w:rPr>
-        <w:t>The dataset has 498 distinct itemids in labevents, all present in d_labitems. The d_labitems table in this download has the columns itemid, label, fluid, category, with no loinc_code column. Therefore the fraction of itemids with a non-null LOINC code is 0/498 = 0%. I did not find LOINC codes anywhere else in the download (a text search of the package for “loinc” returned nothing). If your course materials show a loinc_code column, it comes from a different release of d_labitems; the script handles this: if the column exists it computes the true non-null fraction.</w:t>
+        <w:t>The dataset has 498 distinct itemids in labevents, all present in d_labitems. The d_labitems table in this download has the columns itemid, label, fluid, category, with no loinc_code column. Therefore the fraction of itemids with a non-null LOINC code is 0/498 = 0%. I found no LOINC codes anywhere else in the download (a text search of the package for “loinc” returned nothing). This is expected: according to the MIMIC-IV change log, the loinc_code column was removed from d_labitems in MIMIC-IV v2.0 because the mapped values contained errors, and the demo v2.2 follows that schema. Earlier releases carried it. The analysis code still checks for the column and would compute the true non-null fraction if it were present.</w:t>
       </w:r>
     </w:p>
     <w:p>
@@ -2346,7 +2346,7 @@
         <w:rPr>
           <w:b w:val="0"/>
         </w:rPr>
-        <w:t>For scale: the itemids split into fluid Blood 289, Urine 86 and others, and categories Hematology 238, Chemistry 227, Blood Gas 33. The top 25 itemids account for 58% of lab events and the top 50 for 79%, so manual curation of the head is cheap and covers most of the data. 46 lower-cased labels are shared by more than one itemid (usually the same test with a different fluid or analyzer).</w:t>
+        <w:t>For scale: the itemids split into fluid Blood 289, Urine 86 and others, and categories Hematology 238, Chemistry 227, Blood Gas 33. The top 25 itemids account for 58% of lab events and the top 50 for 79%, so manual curation of the head is cheap and covers most of the data. 46 lower-cased labels are shared by more than one itemid, so the label text alone is not a unique key (fluid has to be considered too).</w:t>
       </w:r>
     </w:p>
     <w:p>
@@ -2418,7 +2418,7 @@
         <w:rPr>
           <w:b w:val="0"/>
         </w:rPr>
-        <w:t>Run: python assignment3_mimic_eda.py &lt;path to mimic-iv-clinical-database-demo-2.2&gt; (writes assignment3_outputs), then python build_report.py. Requires pandas, numpy, scipy, matplotlib, seaborn, python-docx. All figures in this report are generated by that script.</w:t>
+        <w:t>Run: python assignment3_mimic_eda.py &lt;path to mimic-iv-clinical-database-demo-2.2&gt;. Requires pandas, numpy, scipy, matplotlib, seaborn. All figures in this report are generated by that script.</w:t>
       </w:r>
     </w:p>
     <w:sectPr>

</xml_diff>